<commit_message>
NDA redline: legal name per charter — Zed Financial, Inc.
Co-Authored-By: Claude Fable 5 <noreply@anthropic.com>
Claude-Session: https://claude.ai/code/session_0191mfdzKjQFrnE6DWH5jJQc
</commit_message>
<xml_diff>
--- a/inbox/Accial Capital - NDA - Prospective Portfolio Company (Zed redline).docx
+++ b/inbox/Accial Capital - NDA - Prospective Portfolio Company (Zed redline).docx
@@ -145,7 +145,7 @@
           <w:rPr>
             <w:rFonts w:ascii="Calibri" w:hAnsi="Calibri" w:cs="Calibri"/>
           </w:rPr>
-          <w:t xml:space="preserve">Zed Financial Inc, a company incorporated in the State of Delaware, United States of America, and having its registered address at 220 Lombard St, Suite 216, San Francisco, CA 94111, United States of America, hereinafter referred to as (“Zed</w:t>
+          <w:t xml:space="preserve">Zed Financial, Inc., a company incorporated in the State of Delaware, United States of America, and having its registered address at 220 Lombard St, Suite 216, San Francisco, CA 94111, United States of America, hereinafter referred to as (“Zed</w:t>
         </w:r>
       </w:ins>
       <w:r>
@@ -3027,7 +3027,7 @@
             <w:color w:val="000000"/>
             <w:lang w:eastAsia="ja-JP"/>
           </w:rPr>
-          <w:t xml:space="preserve">Zed Financial Inc</w:t>
+          <w:t xml:space="preserve">Zed Financial, Inc.</w:t>
         </w:r>
       </w:ins>
     </w:p>

</xml_diff>